<commit_message>
Update RAG and Streamlit app
</commit_message>
<xml_diff>
--- a/LogBook.docx
+++ b/LogBook.docx
@@ -5,21 +5,19 @@
     <w:p>
       <w:pPr>
         <w:pStyle w:val="1"/>
+        <w:rPr>
+          <w:rFonts w:hint="eastAsia"/>
+        </w:rPr>
       </w:pPr>
       <w:r>
         <w:t>科研学习</w:t>
       </w:r>
       <w:r>
-        <w:t xml:space="preserve"> </w:t>
-      </w:r>
-      <w:proofErr w:type="gramStart"/>
-      <w:r>
-        <w:t>Logbook</w:t>
+        <w:t xml:space="preserve"> Logbook</w:t>
       </w:r>
       <w:r>
         <w:t>｜</w:t>
       </w:r>
-      <w:proofErr w:type="gramEnd"/>
       <w:r>
         <w:t>2026.10.18</w:t>
       </w:r>
@@ -27,6 +25,9 @@
     <w:p>
       <w:pPr>
         <w:pStyle w:val="a5"/>
+        <w:rPr>
+          <w:rFonts w:hint="eastAsia"/>
+        </w:rPr>
       </w:pPr>
       <w:r>
         <w:rPr>
@@ -34,7 +35,6 @@
         </w:rPr>
         <w:t>项目名称</w:t>
       </w:r>
-      <w:proofErr w:type="gramStart"/>
       <w:r>
         <w:rPr>
           <w:bCs/>
@@ -42,48 +42,42 @@
         <w:t>：</w:t>
       </w:r>
       <w:r>
-        <w:t xml:space="preserve"> </w:t>
-      </w:r>
-      <w:r>
         <w:t>基于</w:t>
       </w:r>
       <w:r>
-        <w:t xml:space="preserve"> </w:t>
-      </w:r>
-      <w:proofErr w:type="gramEnd"/>
+        <w:t xml:space="preserve"> RAG </w:t>
+      </w:r>
+      <w:r>
+        <w:t>与多智能体协作的大模型智能科研助手系统</w:t>
+      </w:r>
+    </w:p>
+    <w:p>
+      <w:pPr>
+        <w:pStyle w:val="a5"/>
+        <w:rPr>
+          <w:rFonts w:hint="eastAsia"/>
+        </w:rPr>
+      </w:pPr>
+      <w:r>
+        <w:rPr>
+          <w:bCs/>
+        </w:rPr>
+        <w:t>今日主题</w:t>
+      </w:r>
+      <w:r>
+        <w:rPr>
+          <w:bCs/>
+        </w:rPr>
+        <w:t>：</w:t>
+      </w:r>
       <w:r>
         <w:t xml:space="preserve">RAG </w:t>
       </w:r>
       <w:r>
-        <w:t>与多智能体协作的大模型智能科研助手系统</w:t>
-      </w:r>
-    </w:p>
-    <w:p>
-      <w:pPr>
-        <w:pStyle w:val="a5"/>
-      </w:pPr>
-      <w:r>
-        <w:rPr>
-          <w:bCs/>
-        </w:rPr>
-        <w:t>今日主题：</w:t>
-      </w:r>
-      <w:r>
-        <w:t xml:space="preserve"> RAG </w:t>
-      </w:r>
-      <w:r>
         <w:t>核心功能实现与</w:t>
       </w:r>
       <w:r>
-        <w:t xml:space="preserve"> </w:t>
-      </w:r>
-      <w:proofErr w:type="spellStart"/>
-      <w:r>
-        <w:t>Streamlit</w:t>
-      </w:r>
-      <w:proofErr w:type="spellEnd"/>
-      <w:r>
-        <w:t xml:space="preserve"> </w:t>
+        <w:t xml:space="preserve"> Streamlit </w:t>
       </w:r>
       <w:r>
         <w:t>网页集成</w:t>
@@ -92,6 +86,9 @@
     <w:p>
       <w:pPr>
         <w:pStyle w:val="2"/>
+        <w:rPr>
+          <w:rFonts w:hint="eastAsia"/>
+        </w:rPr>
       </w:pPr>
       <w:r>
         <w:t>一、今日学习内容</w:t>
@@ -103,6 +100,9 @@
           <w:ilvl w:val="0"/>
           <w:numId w:val="10"/>
         </w:numPr>
+        <w:rPr>
+          <w:rFonts w:hint="eastAsia"/>
+        </w:rPr>
       </w:pPr>
       <w:r>
         <w:rPr>
@@ -172,6 +172,9 @@
           <w:ilvl w:val="0"/>
           <w:numId w:val="10"/>
         </w:numPr>
+        <w:rPr>
+          <w:rFonts w:hint="eastAsia"/>
+        </w:rPr>
       </w:pPr>
       <w:r>
         <w:rPr>
@@ -209,6 +212,9 @@
           <w:ilvl w:val="0"/>
           <w:numId w:val="10"/>
         </w:numPr>
+        <w:rPr>
+          <w:rFonts w:hint="eastAsia"/>
+        </w:rPr>
       </w:pPr>
       <w:r>
         <w:rPr>
@@ -240,22 +246,16 @@
           <w:ilvl w:val="0"/>
           <w:numId w:val="10"/>
         </w:numPr>
-      </w:pPr>
-      <w:proofErr w:type="spellStart"/>
-      <w:r>
-        <w:rPr>
-          <w:b/>
-          <w:bCs/>
-        </w:rPr>
-        <w:t>LangChain</w:t>
-      </w:r>
-      <w:proofErr w:type="spellEnd"/>
-      <w:r>
-        <w:rPr>
-          <w:b/>
-          <w:bCs/>
-        </w:rPr>
-        <w:t xml:space="preserve"> </w:t>
+        <w:rPr>
+          <w:rFonts w:hint="eastAsia"/>
+        </w:rPr>
+      </w:pPr>
+      <w:r>
+        <w:rPr>
+          <w:b/>
+          <w:bCs/>
+        </w:rPr>
+        <w:t xml:space="preserve">LangChain </w:t>
       </w:r>
       <w:r>
         <w:rPr>
@@ -273,21 +273,14 @@
       <w:r>
         <w:t>、</w:t>
       </w:r>
-      <w:proofErr w:type="spellStart"/>
       <w:r>
         <w:t>chunk_size</w:t>
       </w:r>
-      <w:proofErr w:type="spellEnd"/>
       <w:r>
         <w:t>、</w:t>
       </w:r>
-      <w:proofErr w:type="spellStart"/>
-      <w:r>
-        <w:t>chunk_overlap</w:t>
-      </w:r>
-      <w:proofErr w:type="spellEnd"/>
-      <w:r>
-        <w:t xml:space="preserve"> </w:t>
+      <w:r>
+        <w:t xml:space="preserve">chunk_overlap </w:t>
       </w:r>
       <w:r>
         <w:t>的含义及其对检索效果的影响。</w:t>
@@ -299,6 +292,9 @@
           <w:ilvl w:val="0"/>
           <w:numId w:val="10"/>
         </w:numPr>
+        <w:rPr>
+          <w:rFonts w:hint="eastAsia"/>
+        </w:rPr>
       </w:pPr>
       <w:r>
         <w:rPr>
@@ -319,33 +315,16 @@
           <w:b/>
           <w:bCs/>
         </w:rPr>
-        <w:t xml:space="preserve"> </w:t>
-      </w:r>
-      <w:proofErr w:type="spellStart"/>
-      <w:r>
-        <w:rPr>
-          <w:b/>
-          <w:bCs/>
-        </w:rPr>
-        <w:t>Streamlit</w:t>
-      </w:r>
-      <w:proofErr w:type="spellEnd"/>
+        <w:t xml:space="preserve"> Streamlit</w:t>
+      </w:r>
       <w:r>
         <w:t>：理解函数封装、模块导入、</w:t>
       </w:r>
       <w:r>
-        <w:t>if __name__ == "__main__</w:t>
-      </w:r>
-      <w:proofErr w:type="gramStart"/>
-      <w:r>
-        <w:t xml:space="preserve">" </w:t>
-      </w:r>
-      <w:r>
-        <w:t>及</w:t>
-      </w:r>
-      <w:proofErr w:type="gramEnd"/>
-      <w:r>
-        <w:t>前后端功能集成。</w:t>
+        <w:t xml:space="preserve">if __name__ == "__main__" </w:t>
+      </w:r>
+      <w:r>
+        <w:t>及前后端功能集成。</w:t>
       </w:r>
     </w:p>
     <w:p>
@@ -354,6 +333,9 @@
           <w:ilvl w:val="0"/>
           <w:numId w:val="10"/>
         </w:numPr>
+        <w:rPr>
+          <w:rFonts w:hint="eastAsia"/>
+        </w:rPr>
       </w:pPr>
       <w:r>
         <w:rPr>
@@ -369,41 +351,33 @@
     <w:p>
       <w:pPr>
         <w:pStyle w:val="2"/>
+        <w:rPr>
+          <w:rFonts w:hint="eastAsia"/>
+        </w:rPr>
       </w:pPr>
       <w:r>
         <w:t>二、今日完成工作</w:t>
       </w:r>
     </w:p>
     <w:p>
-      <w:r>
-        <w:rPr>
-          <w:b/>
-          <w:bCs/>
-        </w:rPr>
-        <w:t>1</w:t>
-      </w:r>
-      <w:proofErr w:type="gramStart"/>
-      <w:r>
-        <w:rPr>
-          <w:b/>
-          <w:bCs/>
-        </w:rPr>
-        <w:t xml:space="preserve">. </w:t>
-      </w:r>
-      <w:r>
-        <w:rPr>
-          <w:b/>
-          <w:bCs/>
-        </w:rPr>
-        <w:t>论文</w:t>
-      </w:r>
-      <w:proofErr w:type="gramEnd"/>
-      <w:r>
-        <w:rPr>
-          <w:b/>
-          <w:bCs/>
-        </w:rPr>
-        <w:t>解析与知识库构建</w:t>
+      <w:pPr>
+        <w:rPr>
+          <w:rFonts w:hint="eastAsia"/>
+        </w:rPr>
+      </w:pPr>
+      <w:r>
+        <w:rPr>
+          <w:b/>
+          <w:bCs/>
+        </w:rPr>
+        <w:t xml:space="preserve">1. </w:t>
+      </w:r>
+      <w:r>
+        <w:rPr>
+          <w:b/>
+          <w:bCs/>
+        </w:rPr>
+        <w:t>论文解析与知识库构建</w:t>
       </w:r>
     </w:p>
     <w:p>
@@ -412,32 +386,22 @@
           <w:ilvl w:val="0"/>
           <w:numId w:val="11"/>
         </w:numPr>
+        <w:rPr>
+          <w:rFonts w:hint="eastAsia"/>
+        </w:rPr>
       </w:pPr>
       <w:r>
         <w:t>使用</w:t>
       </w:r>
       <w:r>
-        <w:t xml:space="preserve"> </w:t>
-      </w:r>
-      <w:proofErr w:type="spellStart"/>
-      <w:r>
-        <w:t>PyMuPDF</w:t>
-      </w:r>
-      <w:proofErr w:type="spellEnd"/>
-      <w:r>
-        <w:t xml:space="preserve"> </w:t>
-      </w:r>
-      <w:r>
-        <w:t>提取一</w:t>
-      </w:r>
-      <w:proofErr w:type="gramStart"/>
-      <w:r>
-        <w:t>篇</w:t>
+        <w:t xml:space="preserve"> PyMuPDF </w:t>
+      </w:r>
+      <w:r>
+        <w:t>提取一篇</w:t>
       </w:r>
       <w:r>
         <w:t xml:space="preserve"> 11 </w:t>
       </w:r>
-      <w:proofErr w:type="gramEnd"/>
       <w:r>
         <w:t>页</w:t>
       </w:r>
@@ -454,31 +418,22 @@
           <w:ilvl w:val="0"/>
           <w:numId w:val="11"/>
         </w:numPr>
+        <w:rPr>
+          <w:rFonts w:hint="eastAsia"/>
+        </w:rPr>
       </w:pPr>
       <w:r>
         <w:t>使用</w:t>
       </w:r>
       <w:r>
+        <w:t xml:space="preserve"> LangChain </w:t>
+      </w:r>
+      <w:r>
+        <w:t>进行文本切分，生成</w:t>
+      </w:r>
+      <w:r>
         <w:t xml:space="preserve"> </w:t>
       </w:r>
-      <w:proofErr w:type="spellStart"/>
-      <w:r>
-        <w:t>LangChain</w:t>
-      </w:r>
-      <w:proofErr w:type="spellEnd"/>
-      <w:r>
-        <w:t xml:space="preserve"> </w:t>
-      </w:r>
-      <w:r>
-        <w:t>进行文本切分，</w:t>
-      </w:r>
-      <w:proofErr w:type="gramStart"/>
-      <w:r>
-        <w:t>生成</w:t>
-      </w:r>
-      <w:r>
-        <w:t xml:space="preserve"> </w:t>
-      </w:r>
       <w:r>
         <w:rPr>
           <w:b/>
@@ -486,7 +441,6 @@
         </w:rPr>
         <w:t xml:space="preserve">63 </w:t>
       </w:r>
-      <w:proofErr w:type="gramEnd"/>
       <w:r>
         <w:rPr>
           <w:b/>
@@ -504,24 +458,14 @@
       <w:r>
         <w:t>（</w:t>
       </w:r>
-      <w:proofErr w:type="spellStart"/>
-      <w:r>
-        <w:t>chunk_size</w:t>
-      </w:r>
-      <w:proofErr w:type="spellEnd"/>
-      <w:r>
-        <w:t>=1000</w:t>
+      <w:r>
+        <w:t>chunk_size=1000</w:t>
       </w:r>
       <w:r>
         <w:t>，</w:t>
       </w:r>
-      <w:proofErr w:type="spellStart"/>
-      <w:r>
-        <w:t>chunk_overlap</w:t>
-      </w:r>
-      <w:proofErr w:type="spellEnd"/>
-      <w:r>
-        <w:t>=200</w:t>
+      <w:r>
+        <w:t>chunk_overlap=200</w:t>
       </w:r>
       <w:r>
         <w:t>）。</w:t>
@@ -533,37 +477,28 @@
           <w:ilvl w:val="0"/>
           <w:numId w:val="11"/>
         </w:numPr>
+        <w:rPr>
+          <w:rFonts w:hint="eastAsia"/>
+        </w:rPr>
       </w:pPr>
       <w:r>
         <w:t>使用多语言</w:t>
       </w:r>
       <w:r>
+        <w:t xml:space="preserve"> MiniLM </w:t>
+      </w:r>
+      <w:r>
+        <w:t>模型将每个</w:t>
+      </w:r>
+      <w:r>
+        <w:t xml:space="preserve"> Chunk </w:t>
+      </w:r>
+      <w:r>
+        <w:t>转换为</w:t>
+      </w:r>
+      <w:r>
         <w:t xml:space="preserve"> </w:t>
       </w:r>
-      <w:proofErr w:type="spellStart"/>
-      <w:r>
-        <w:t>MiniLM</w:t>
-      </w:r>
-      <w:proofErr w:type="spellEnd"/>
-      <w:r>
-        <w:t xml:space="preserve"> </w:t>
-      </w:r>
-      <w:r>
-        <w:t>模型将每个</w:t>
-      </w:r>
-      <w:r>
-        <w:t xml:space="preserve"> Chunk </w:t>
-      </w:r>
-      <w:r>
-        <w:t>转换</w:t>
-      </w:r>
-      <w:proofErr w:type="gramStart"/>
-      <w:r>
-        <w:t>为</w:t>
-      </w:r>
-      <w:r>
-        <w:t xml:space="preserve"> </w:t>
-      </w:r>
       <w:r>
         <w:rPr>
           <w:b/>
@@ -571,7 +506,6 @@
         </w:rPr>
         <w:t xml:space="preserve">384 </w:t>
       </w:r>
-      <w:proofErr w:type="gramEnd"/>
       <w:r>
         <w:rPr>
           <w:b/>
@@ -589,6 +523,9 @@
           <w:ilvl w:val="0"/>
           <w:numId w:val="11"/>
         </w:numPr>
+        <w:rPr>
+          <w:rFonts w:hint="eastAsia"/>
+        </w:rPr>
       </w:pPr>
       <w:r>
         <w:t>使用</w:t>
@@ -601,6 +538,11 @@
       </w:r>
     </w:p>
     <w:p>
+      <w:pPr>
+        <w:rPr>
+          <w:rFonts w:hint="eastAsia"/>
+        </w:rPr>
+      </w:pPr>
       <w:r>
         <w:rPr>
           <w:b/>
@@ -622,23 +564,18 @@
           <w:ilvl w:val="0"/>
           <w:numId w:val="12"/>
         </w:numPr>
+        <w:rPr>
+          <w:rFonts w:hint="eastAsia"/>
+        </w:rPr>
       </w:pPr>
       <w:r>
         <w:t>实现中文问题向量化及</w:t>
       </w:r>
       <w:r>
-        <w:t xml:space="preserve"> Top</w:t>
-      </w:r>
-      <w:proofErr w:type="gramStart"/>
-      <w:r>
-        <w:t xml:space="preserve">-3 </w:t>
-      </w:r>
-      <w:r>
-        <w:t>相关</w:t>
-      </w:r>
-      <w:proofErr w:type="gramEnd"/>
-      <w:r>
-        <w:t>论文片段检索。</w:t>
+        <w:t xml:space="preserve"> Top-3 </w:t>
+      </w:r>
+      <w:r>
+        <w:t>相关论文片段检索。</w:t>
       </w:r>
     </w:p>
     <w:p>
@@ -647,6 +584,9 @@
           <w:ilvl w:val="0"/>
           <w:numId w:val="12"/>
         </w:numPr>
+        <w:rPr>
+          <w:rFonts w:hint="eastAsia"/>
+        </w:rPr>
       </w:pPr>
       <w:r>
         <w:t>将检索结果作为</w:t>
@@ -670,6 +610,9 @@
           <w:ilvl w:val="0"/>
           <w:numId w:val="12"/>
         </w:numPr>
+        <w:rPr>
+          <w:rFonts w:hint="eastAsia"/>
+        </w:rPr>
       </w:pPr>
       <w:r>
         <w:t>完成普通</w:t>
@@ -700,35 +643,24 @@
       </w:r>
     </w:p>
     <w:p>
-      <w:r>
-        <w:rPr>
-          <w:b/>
-          <w:bCs/>
-        </w:rPr>
-        <w:t>3</w:t>
-      </w:r>
-      <w:proofErr w:type="gramStart"/>
-      <w:r>
-        <w:rPr>
-          <w:b/>
-          <w:bCs/>
-        </w:rPr>
-        <w:t xml:space="preserve">. </w:t>
-      </w:r>
-      <w:r>
-        <w:rPr>
-          <w:b/>
-          <w:bCs/>
-        </w:rPr>
-        <w:t>代码</w:t>
-      </w:r>
-      <w:proofErr w:type="gramEnd"/>
-      <w:r>
-        <w:rPr>
-          <w:b/>
-          <w:bCs/>
-        </w:rPr>
-        <w:t>优化与网页集成</w:t>
+      <w:pPr>
+        <w:rPr>
+          <w:rFonts w:hint="eastAsia"/>
+        </w:rPr>
+      </w:pPr>
+      <w:r>
+        <w:rPr>
+          <w:b/>
+          <w:bCs/>
+        </w:rPr>
+        <w:t xml:space="preserve">3. </w:t>
+      </w:r>
+      <w:r>
+        <w:rPr>
+          <w:b/>
+          <w:bCs/>
+        </w:rPr>
+        <w:t>代码优化与网页集成</w:t>
       </w:r>
     </w:p>
     <w:p>
@@ -737,6 +669,9 @@
           <w:ilvl w:val="0"/>
           <w:numId w:val="13"/>
         </w:numPr>
+        <w:rPr>
+          <w:rFonts w:hint="eastAsia"/>
+        </w:rPr>
       </w:pPr>
       <w:r>
         <w:t>将</w:t>
@@ -766,6 +701,9 @@
           <w:ilvl w:val="0"/>
           <w:numId w:val="13"/>
         </w:numPr>
+        <w:rPr>
+          <w:rFonts w:hint="eastAsia"/>
+        </w:rPr>
       </w:pPr>
       <w:r>
         <w:t>避免每次提问时重复进行整篇论文向量化。</w:t>
@@ -777,39 +715,21 @@
           <w:ilvl w:val="0"/>
           <w:numId w:val="13"/>
         </w:numPr>
+        <w:rPr>
+          <w:rFonts w:hint="eastAsia"/>
+        </w:rPr>
       </w:pPr>
       <w:r>
         <w:t>将</w:t>
       </w:r>
       <w:r>
-        <w:t xml:space="preserve"> </w:t>
-      </w:r>
-      <w:proofErr w:type="spellStart"/>
-      <w:r>
-        <w:t>rag_answer</w:t>
-      </w:r>
-      <w:proofErr w:type="spellEnd"/>
-      <w:r>
-        <w:t>(</w:t>
-      </w:r>
-      <w:proofErr w:type="gramStart"/>
-      <w:r>
-        <w:t xml:space="preserve">) </w:t>
+        <w:t xml:space="preserve"> rag_answer() </w:t>
       </w:r>
       <w:r>
         <w:t>接入</w:t>
       </w:r>
       <w:r>
-        <w:t xml:space="preserve"> </w:t>
-      </w:r>
-      <w:proofErr w:type="spellStart"/>
-      <w:proofErr w:type="gramEnd"/>
-      <w:r>
-        <w:t>Streamlit</w:t>
-      </w:r>
-      <w:proofErr w:type="spellEnd"/>
-      <w:r>
-        <w:t xml:space="preserve"> app.py</w:t>
+        <w:t xml:space="preserve"> Streamlit app.py</w:t>
       </w:r>
       <w:r>
         <w:t>。</w:t>
@@ -821,6 +741,9 @@
           <w:ilvl w:val="0"/>
           <w:numId w:val="13"/>
         </w:numPr>
+        <w:rPr>
+          <w:rFonts w:hint="eastAsia"/>
+        </w:rPr>
       </w:pPr>
       <w:r>
         <w:t>实现</w:t>
@@ -853,6 +776,9 @@
     <w:p>
       <w:pPr>
         <w:pStyle w:val="2"/>
+        <w:rPr>
+          <w:rFonts w:hint="eastAsia"/>
+        </w:rPr>
       </w:pPr>
       <w:r>
         <w:t>三、遇到的问题及解决方法</w:t>
@@ -879,6 +805,7 @@
             <w:pPr>
               <w:jc w:val="center"/>
               <w:rPr>
+                <w:rFonts w:hint="eastAsia"/>
                 <w:b/>
                 <w:bCs/>
               </w:rPr>
@@ -902,6 +829,7 @@
             <w:pPr>
               <w:jc w:val="center"/>
               <w:rPr>
+                <w:rFonts w:hint="eastAsia"/>
                 <w:b/>
                 <w:bCs/>
               </w:rPr>
@@ -927,6 +855,7 @@
             <w:pPr>
               <w:jc w:val="center"/>
               <w:rPr>
+                <w:rFonts w:hint="eastAsia"/>
                 <w:b/>
                 <w:bCs/>
               </w:rPr>
@@ -963,8 +892,10 @@
           <w:p>
             <w:pPr>
               <w:jc w:val="center"/>
+              <w:rPr>
+                <w:rFonts w:hint="eastAsia"/>
+              </w:rPr>
             </w:pPr>
-            <w:proofErr w:type="gramStart"/>
             <w:r>
               <w:t>明确</w:t>
             </w:r>
@@ -972,13 +903,8 @@
               <w:t xml:space="preserve"> 63 </w:t>
             </w:r>
             <w:r>
-              <w:t>是</w:t>
+              <w:t>是文本块数量，</w:t>
             </w:r>
-            <w:proofErr w:type="gramEnd"/>
-            <w:r>
-              <w:t>文本块数量，</w:t>
-            </w:r>
-            <w:proofErr w:type="gramStart"/>
             <w:r>
               <w:t xml:space="preserve">384 </w:t>
             </w:r>
@@ -986,11 +912,7 @@
               <w:t>是</w:t>
             </w:r>
             <w:r>
-              <w:t xml:space="preserve"> </w:t>
-            </w:r>
-            <w:proofErr w:type="gramEnd"/>
-            <w:r>
-              <w:t xml:space="preserve">Embedding </w:t>
+              <w:t xml:space="preserve"> Embedding </w:t>
             </w:r>
             <w:r>
               <w:t>向量维度</w:t>
@@ -1009,6 +931,7 @@
             <w:pPr>
               <w:jc w:val="center"/>
               <w:rPr>
+                <w:rFonts w:hint="eastAsia"/>
                 <w:b/>
                 <w:bCs/>
               </w:rPr>
@@ -1039,6 +962,9 @@
           <w:p>
             <w:pPr>
               <w:jc w:val="center"/>
+              <w:rPr>
+                <w:rFonts w:hint="eastAsia"/>
+              </w:rPr>
             </w:pPr>
             <w:r>
               <w:t>优化</w:t>
@@ -1063,6 +989,7 @@
             <w:pPr>
               <w:jc w:val="center"/>
               <w:rPr>
+                <w:rFonts w:hint="eastAsia"/>
                 <w:b/>
                 <w:bCs/>
               </w:rPr>
@@ -1085,6 +1012,9 @@
           <w:p>
             <w:pPr>
               <w:jc w:val="center"/>
+              <w:rPr>
+                <w:rFonts w:hint="eastAsia"/>
+              </w:rPr>
             </w:pPr>
             <w:r>
               <w:t>分离入库与检索功能，复用已有</w:t>
@@ -1109,6 +1039,7 @@
             <w:pPr>
               <w:jc w:val="center"/>
               <w:rPr>
+                <w:rFonts w:hint="eastAsia"/>
                 <w:b/>
                 <w:bCs/>
               </w:rPr>
@@ -1152,18 +1083,16 @@
           <w:p>
             <w:pPr>
               <w:jc w:val="center"/>
+              <w:rPr>
+                <w:rFonts w:hint="eastAsia"/>
+              </w:rPr>
             </w:pPr>
             <w:r>
               <w:t>调整</w:t>
             </w:r>
             <w:r>
-              <w:t xml:space="preserve"> </w:t>
+              <w:t xml:space="preserve"> max_tokens</w:t>
             </w:r>
-            <w:proofErr w:type="spellStart"/>
-            <w:r>
-              <w:t>max_tokens</w:t>
-            </w:r>
-            <w:proofErr w:type="spellEnd"/>
             <w:r>
               <w:t>，并限制</w:t>
             </w:r>
@@ -1187,25 +1116,17 @@
             <w:pPr>
               <w:jc w:val="center"/>
               <w:rPr>
+                <w:rFonts w:hint="eastAsia"/>
                 <w:b/>
                 <w:bCs/>
               </w:rPr>
             </w:pPr>
-            <w:proofErr w:type="spellStart"/>
             <w:r>
               <w:rPr>
                 <w:b/>
                 <w:bCs/>
               </w:rPr>
-              <w:t>Streamlit</w:t>
-            </w:r>
-            <w:proofErr w:type="spellEnd"/>
-            <w:r>
-              <w:rPr>
-                <w:b/>
-                <w:bCs/>
-              </w:rPr>
-              <w:t xml:space="preserve"> </w:t>
+              <w:t xml:space="preserve">Streamlit </w:t>
             </w:r>
             <w:r>
               <w:rPr>
@@ -1219,17 +1140,8 @@
                 <w:b/>
                 <w:bCs/>
               </w:rPr>
-              <w:t xml:space="preserve"> </w:t>
+              <w:t xml:space="preserve"> NameError</w:t>
             </w:r>
-            <w:proofErr w:type="spellStart"/>
-            <w:r>
-              <w:rPr>
-                <w:b/>
-                <w:bCs/>
-              </w:rPr>
-              <w:t>NameError</w:t>
-            </w:r>
-            <w:proofErr w:type="spellEnd"/>
           </w:p>
         </w:tc>
         <w:tc>
@@ -1241,6 +1153,9 @@
           <w:p>
             <w:pPr>
               <w:jc w:val="center"/>
+              <w:rPr>
+                <w:rFonts w:hint="eastAsia"/>
+              </w:rPr>
             </w:pPr>
             <w:r>
               <w:t>删除</w:t>
@@ -1264,6 +1179,9 @@
           <w:p>
             <w:pPr>
               <w:jc w:val="center"/>
+              <w:rPr>
+                <w:rFonts w:hint="eastAsia"/>
+              </w:rPr>
             </w:pPr>
             <w:r>
               <w:t>检索结果存在文本截断及排序问题</w:t>
@@ -1279,6 +1197,9 @@
           <w:p>
             <w:pPr>
               <w:jc w:val="center"/>
+              <w:rPr>
+                <w:rFonts w:hint="eastAsia"/>
+              </w:rPr>
             </w:pPr>
             <w:r>
               <w:t>明确打印截断与原始数据的区别；检索质量留待后续优化</w:t>
@@ -1290,12 +1211,20 @@
     <w:p>
       <w:pPr>
         <w:pStyle w:val="2"/>
+        <w:rPr>
+          <w:rFonts w:hint="eastAsia"/>
+        </w:rPr>
       </w:pPr>
       <w:r>
         <w:t>四、核心技术流程</w:t>
       </w:r>
     </w:p>
     <w:p>
+      <w:pPr>
+        <w:rPr>
+          <w:rFonts w:hint="eastAsia"/>
+        </w:rPr>
+      </w:pPr>
       <w:r>
         <w:rPr>
           <w:b/>
@@ -1305,112 +1234,75 @@
       </w:r>
     </w:p>
     <w:p>
-      <w:r>
-        <w:t xml:space="preserve">PDF → </w:t>
-      </w:r>
-      <w:proofErr w:type="spellStart"/>
-      <w:r>
-        <w:t>PyMuPDF</w:t>
-      </w:r>
-      <w:proofErr w:type="spellEnd"/>
-      <w:r>
-        <w:t xml:space="preserve"> </w:t>
-      </w:r>
-      <w:r>
-        <w:t>文本</w:t>
-      </w:r>
-      <w:proofErr w:type="gramStart"/>
-      <w:r>
-        <w:t>提取</w:t>
+      <w:pPr>
+        <w:rPr>
+          <w:rFonts w:hint="eastAsia"/>
+        </w:rPr>
+      </w:pPr>
+      <w:r>
+        <w:t xml:space="preserve">PDF → PyMuPDF </w:t>
+      </w:r>
+      <w:r>
+        <w:t>文本提取</w:t>
+      </w:r>
+      <w:r>
+        <w:t xml:space="preserve"> → LangChain </w:t>
+      </w:r>
+      <w:r>
+        <w:t>文本切分</w:t>
+      </w:r>
+      <w:r>
+        <w:t xml:space="preserve"> → MiniLM Embedding → Chroma </w:t>
+      </w:r>
+      <w:r>
+        <w:t>向量数据库</w:t>
+      </w:r>
+    </w:p>
+    <w:p>
+      <w:pPr>
+        <w:rPr>
+          <w:rFonts w:hint="eastAsia"/>
+        </w:rPr>
+      </w:pPr>
+      <w:r>
+        <w:rPr>
+          <w:b/>
+          <w:bCs/>
+        </w:rPr>
+        <w:t xml:space="preserve">RAG </w:t>
+      </w:r>
+      <w:r>
+        <w:rPr>
+          <w:b/>
+          <w:bCs/>
+        </w:rPr>
+        <w:t>问答：</w:t>
+      </w:r>
+    </w:p>
+    <w:p>
+      <w:pPr>
+        <w:rPr>
+          <w:rFonts w:hint="eastAsia"/>
+        </w:rPr>
+      </w:pPr>
+      <w:r>
+        <w:t>用户问题</w:t>
       </w:r>
       <w:r>
         <w:t xml:space="preserve"> → </w:t>
       </w:r>
-      <w:proofErr w:type="spellStart"/>
-      <w:proofErr w:type="gramEnd"/>
-      <w:r>
-        <w:t>LangChain</w:t>
-      </w:r>
-      <w:proofErr w:type="spellEnd"/>
-      <w:r>
-        <w:t xml:space="preserve"> </w:t>
-      </w:r>
-      <w:r>
-        <w:t>文本</w:t>
-      </w:r>
-      <w:proofErr w:type="gramStart"/>
-      <w:r>
-        <w:t>切分</w:t>
+      <w:r>
+        <w:t>问题向量化</w:t>
+      </w:r>
+      <w:r>
+        <w:t xml:space="preserve"> → Chroma </w:t>
+      </w:r>
+      <w:r>
+        <w:t>语义检索</w:t>
       </w:r>
       <w:r>
         <w:t xml:space="preserve"> → </w:t>
       </w:r>
-      <w:proofErr w:type="spellStart"/>
-      <w:proofErr w:type="gramEnd"/>
-      <w:r>
-        <w:t>MiniLM</w:t>
-      </w:r>
-      <w:proofErr w:type="spellEnd"/>
-      <w:r>
-        <w:t xml:space="preserve"> Embedding → Chroma </w:t>
-      </w:r>
-      <w:r>
-        <w:t>向量数据库</w:t>
-      </w:r>
-    </w:p>
-    <w:p>
-      <w:r>
-        <w:rPr>
-          <w:b/>
-          <w:bCs/>
-        </w:rPr>
-        <w:t xml:space="preserve">RAG </w:t>
-      </w:r>
-      <w:r>
-        <w:rPr>
-          <w:b/>
-          <w:bCs/>
-        </w:rPr>
-        <w:t>问答：</w:t>
-      </w:r>
-    </w:p>
-    <w:p>
-      <w:r>
-        <w:t>用户</w:t>
-      </w:r>
-      <w:proofErr w:type="gramStart"/>
-      <w:r>
-        <w:t>问题</w:t>
-      </w:r>
-      <w:r>
-        <w:t xml:space="preserve"> → </w:t>
-      </w:r>
-      <w:proofErr w:type="gramEnd"/>
-      <w:r>
-        <w:t>问题向量</w:t>
-      </w:r>
-      <w:proofErr w:type="gramStart"/>
-      <w:r>
-        <w:t>化</w:t>
-      </w:r>
-      <w:r>
-        <w:t xml:space="preserve"> → </w:t>
-      </w:r>
-      <w:proofErr w:type="gramEnd"/>
-      <w:r>
-        <w:t xml:space="preserve">Chroma </w:t>
-      </w:r>
-      <w:r>
-        <w:t>语义</w:t>
-      </w:r>
-      <w:proofErr w:type="gramStart"/>
-      <w:r>
-        <w:t>检索</w:t>
-      </w:r>
-      <w:r>
-        <w:t xml:space="preserve"> → </w:t>
-      </w:r>
-      <w:proofErr w:type="gramEnd"/>
       <w:r>
         <w:t>构建</w:t>
       </w:r>
@@ -1418,29 +1310,21 @@
         <w:t xml:space="preserve"> Context → DeepSeek </w:t>
       </w:r>
       <w:r>
-        <w:t>生成</w:t>
-      </w:r>
-      <w:proofErr w:type="gramStart"/>
-      <w:r>
-        <w:t>回答</w:t>
-      </w:r>
-      <w:r>
-        <w:t xml:space="preserve"> → </w:t>
-      </w:r>
-      <w:proofErr w:type="spellStart"/>
-      <w:proofErr w:type="gramEnd"/>
-      <w:r>
-        <w:t>Streamlit</w:t>
-      </w:r>
-      <w:proofErr w:type="spellEnd"/>
-      <w:r>
-        <w:t xml:space="preserve"> </w:t>
+        <w:t>生成回答</w:t>
+      </w:r>
+      <w:r>
+        <w:t xml:space="preserve"> → Streamlit </w:t>
       </w:r>
       <w:r>
         <w:t>展示</w:t>
       </w:r>
     </w:p>
     <w:p>
+      <w:pPr>
+        <w:rPr>
+          <w:rFonts w:hint="eastAsia"/>
+        </w:rPr>
+      </w:pPr>
       <w:r>
         <w:rPr>
           <w:b/>
@@ -1455,6 +1339,9 @@
           <w:ilvl w:val="0"/>
           <w:numId w:val="14"/>
         </w:numPr>
+        <w:rPr>
+          <w:rFonts w:hint="eastAsia"/>
+        </w:rPr>
       </w:pPr>
       <w:r>
         <w:t>rag.py</w:t>
@@ -1475,6 +1362,9 @@
           <w:ilvl w:val="0"/>
           <w:numId w:val="14"/>
         </w:numPr>
+        <w:rPr>
+          <w:rFonts w:hint="eastAsia"/>
+        </w:rPr>
       </w:pPr>
       <w:r>
         <w:t>llm_client.py</w:t>
@@ -1495,6 +1385,9 @@
           <w:ilvl w:val="0"/>
           <w:numId w:val="14"/>
         </w:numPr>
+        <w:rPr>
+          <w:rFonts w:hint="eastAsia"/>
+        </w:rPr>
       </w:pPr>
       <w:r>
         <w:t>app.py</w:t>
@@ -1502,13 +1395,8 @@
       <w:r>
         <w:t>：</w:t>
       </w:r>
-      <w:proofErr w:type="spellStart"/>
-      <w:r>
-        <w:t>Streamlit</w:t>
-      </w:r>
-      <w:proofErr w:type="spellEnd"/>
-      <w:r>
-        <w:t xml:space="preserve"> </w:t>
+      <w:r>
+        <w:t xml:space="preserve">Streamlit </w:t>
       </w:r>
       <w:r>
         <w:t>网页交互。</w:t>
@@ -1520,17 +1408,12 @@
           <w:ilvl w:val="0"/>
           <w:numId w:val="14"/>
         </w:numPr>
-      </w:pPr>
-      <w:r>
-        <w:t>data/</w:t>
-      </w:r>
-      <w:proofErr w:type="spellStart"/>
-      <w:r>
-        <w:t>chroma_db</w:t>
-      </w:r>
-      <w:proofErr w:type="spellEnd"/>
-      <w:r>
-        <w:t>/</w:t>
+        <w:rPr>
+          <w:rFonts w:hint="eastAsia"/>
+        </w:rPr>
+      </w:pPr>
+      <w:r>
+        <w:t>data/chroma_db/</w:t>
       </w:r>
       <w:r>
         <w:t>：本地论文向量数据库。</w:t>
@@ -1539,12 +1422,20 @@
     <w:p>
       <w:pPr>
         <w:pStyle w:val="2"/>
+        <w:rPr>
+          <w:rFonts w:hint="eastAsia"/>
+        </w:rPr>
       </w:pPr>
       <w:r>
         <w:t>五、今日收获与总结</w:t>
       </w:r>
     </w:p>
     <w:p>
+      <w:pPr>
+        <w:rPr>
+          <w:rFonts w:hint="eastAsia"/>
+        </w:rPr>
+      </w:pPr>
       <w:r>
         <w:t>通过实际开发，理解了</w:t>
       </w:r>
@@ -1568,6 +1459,11 @@
       </w:r>
     </w:p>
     <w:p>
+      <w:pPr>
+        <w:rPr>
+          <w:rFonts w:hint="eastAsia"/>
+        </w:rPr>
+      </w:pPr>
       <w:r>
         <w:t>通过普通</w:t>
       </w:r>
@@ -1605,6 +1501,11 @@
       </w:r>
     </w:p>
     <w:p>
+      <w:pPr>
+        <w:rPr>
+          <w:rFonts w:hint="eastAsia"/>
+        </w:rPr>
+      </w:pPr>
       <w:r>
         <w:t>同时，通过代码重构和错误排查，进一步理解了</w:t>
       </w:r>
@@ -1616,6 +1517,11 @@
       </w:r>
     </w:p>
     <w:p>
+      <w:pPr>
+        <w:rPr>
+          <w:rFonts w:hint="eastAsia"/>
+        </w:rPr>
+      </w:pPr>
       <w:r>
         <w:rPr>
           <w:b/>
@@ -1639,15 +1545,7 @@
         <w:t>和</w:t>
       </w:r>
       <w:r>
-        <w:t xml:space="preserve"> </w:t>
-      </w:r>
-      <w:proofErr w:type="spellStart"/>
-      <w:r>
-        <w:t>Streamlit</w:t>
-      </w:r>
-      <w:proofErr w:type="spellEnd"/>
-      <w:r>
-        <w:t xml:space="preserve"> </w:t>
+        <w:t xml:space="preserve"> Streamlit </w:t>
       </w:r>
       <w:r>
         <w:t>的单论文</w:t>
@@ -1662,6 +1560,9 @@
     <w:p>
       <w:pPr>
         <w:pStyle w:val="2"/>
+        <w:rPr>
+          <w:rFonts w:hint="eastAsia"/>
+        </w:rPr>
       </w:pPr>
       <w:r>
         <w:t>六、下一步计划</w:t>
@@ -1673,20 +1574,15 @@
           <w:ilvl w:val="0"/>
           <w:numId w:val="15"/>
         </w:numPr>
+        <w:rPr>
+          <w:rFonts w:hint="eastAsia"/>
+        </w:rPr>
       </w:pPr>
       <w:r>
         <w:t>实现</w:t>
       </w:r>
       <w:r>
-        <w:t xml:space="preserve"> </w:t>
-      </w:r>
-      <w:proofErr w:type="spellStart"/>
-      <w:r>
-        <w:t>Streamlit</w:t>
-      </w:r>
-      <w:proofErr w:type="spellEnd"/>
-      <w:r>
-        <w:t xml:space="preserve"> </w:t>
+        <w:t xml:space="preserve"> Streamlit </w:t>
       </w:r>
       <w:r>
         <w:t>网页</w:t>
@@ -1704,6 +1600,9 @@
           <w:ilvl w:val="0"/>
           <w:numId w:val="15"/>
         </w:numPr>
+        <w:rPr>
+          <w:rFonts w:hint="eastAsia"/>
+        </w:rPr>
       </w:pPr>
       <w:r>
         <w:t>支持多论文知识库管理、指定论文检索和跨论文问答。</w:t>
@@ -1715,6 +1614,9 @@
           <w:ilvl w:val="0"/>
           <w:numId w:val="15"/>
         </w:numPr>
+        <w:rPr>
+          <w:rFonts w:hint="eastAsia"/>
+        </w:rPr>
       </w:pPr>
       <w:r>
         <w:t>优化检索质量、引用准确性及多轮对话能力。</w:t>
@@ -1726,6 +1628,9 @@
           <w:ilvl w:val="0"/>
           <w:numId w:val="15"/>
         </w:numPr>
+        <w:rPr>
+          <w:rFonts w:hint="eastAsia"/>
+        </w:rPr>
       </w:pPr>
       <w:r>
         <w:t>开发论文摘要、文献对比等科研辅助功能。</w:t>
@@ -1737,18 +1642,16 @@
           <w:ilvl w:val="0"/>
           <w:numId w:val="15"/>
         </w:numPr>
+        <w:rPr>
+          <w:rFonts w:hint="eastAsia"/>
+        </w:rPr>
       </w:pPr>
       <w:r>
         <w:t>进一步学习</w:t>
       </w:r>
       <w:r>
-        <w:t xml:space="preserve"> </w:t>
-      </w:r>
-      <w:proofErr w:type="spellStart"/>
-      <w:r>
-        <w:t>LangGraph</w:t>
-      </w:r>
-      <w:proofErr w:type="spellEnd"/>
+        <w:t xml:space="preserve"> LangGraph</w:t>
+      </w:r>
       <w:r>
         <w:t>，设计并实现</w:t>
       </w:r>
@@ -1765,6 +1668,9 @@
           <w:ilvl w:val="0"/>
           <w:numId w:val="15"/>
         </w:numPr>
+        <w:rPr>
+          <w:rFonts w:hint="eastAsia"/>
+        </w:rPr>
       </w:pPr>
       <w:r>
         <w:t>开展系统功能测试及</w:t>
@@ -1782,7 +1688,1155 @@
         <w:t>效果评估。</w:t>
       </w:r>
     </w:p>
-    <w:p/>
+    <w:p>
+      <w:pPr>
+        <w:widowControl/>
+        <w:jc w:val="left"/>
+        <w:rPr>
+          <w:rFonts w:hint="eastAsia"/>
+        </w:rPr>
+      </w:pPr>
+      <w:r>
+        <w:rPr>
+          <w:rFonts w:hint="eastAsia"/>
+        </w:rPr>
+        <w:br w:type="page"/>
+      </w:r>
+    </w:p>
+    <w:p>
+      <w:pPr>
+        <w:pStyle w:val="1"/>
+      </w:pPr>
+      <w:r>
+        <w:lastRenderedPageBreak/>
+        <w:t>科研学习</w:t>
+      </w:r>
+      <w:r>
+        <w:t xml:space="preserve"> Logbook</w:t>
+      </w:r>
+      <w:r>
+        <w:t>｜</w:t>
+      </w:r>
+      <w:r>
+        <w:t>2026.10.19</w:t>
+      </w:r>
+    </w:p>
+    <w:p>
+      <w:pPr>
+        <w:pStyle w:val="a5"/>
+      </w:pPr>
+      <w:r>
+        <w:rPr>
+          <w:bCs/>
+        </w:rPr>
+        <w:t>项目名称</w:t>
+      </w:r>
+      <w:r>
+        <w:rPr>
+          <w:bCs/>
+        </w:rPr>
+        <w:t>：</w:t>
+      </w:r>
+      <w:r>
+        <w:t>基于</w:t>
+      </w:r>
+      <w:r>
+        <w:t xml:space="preserve"> RAG </w:t>
+      </w:r>
+      <w:r>
+        <w:t>与多智能体协作的大模型智能科研助手系统</w:t>
+      </w:r>
+    </w:p>
+    <w:p>
+      <w:pPr>
+        <w:pStyle w:val="a5"/>
+      </w:pPr>
+      <w:r>
+        <w:rPr>
+          <w:bCs/>
+        </w:rPr>
+        <w:t>今日主题</w:t>
+      </w:r>
+      <w:r>
+        <w:rPr>
+          <w:bCs/>
+        </w:rPr>
+        <w:t>：</w:t>
+      </w:r>
+      <w:r>
+        <w:t xml:space="preserve">RAG </w:t>
+      </w:r>
+      <w:r>
+        <w:t>页码范围检索、长文本分批总结与检索质量问题排查</w:t>
+      </w:r>
+    </w:p>
+    <w:p>
+      <w:pPr>
+        <w:pStyle w:val="2"/>
+      </w:pPr>
+      <w:r>
+        <w:t>一、今日学习内容</w:t>
+      </w:r>
+    </w:p>
+    <w:p>
+      <w:pPr>
+        <w:numPr>
+          <w:ilvl w:val="0"/>
+          <w:numId w:val="16"/>
+        </w:numPr>
+      </w:pPr>
+      <w:r>
+        <w:rPr>
+          <w:b/>
+          <w:bCs/>
+        </w:rPr>
+        <w:t>向量检索与</w:t>
+      </w:r>
+      <w:r>
+        <w:rPr>
+          <w:b/>
+          <w:bCs/>
+        </w:rPr>
+        <w:t xml:space="preserve"> Top-K</w:t>
+      </w:r>
+      <w:r>
+        <w:rPr>
+          <w:b/>
+          <w:bCs/>
+        </w:rPr>
+        <w:t>（</w:t>
+      </w:r>
+      <w:r>
+        <w:rPr>
+          <w:b/>
+          <w:bCs/>
+        </w:rPr>
+        <w:t>Top-K Retrieval</w:t>
+      </w:r>
+      <w:r>
+        <w:rPr>
+          <w:b/>
+          <w:bCs/>
+        </w:rPr>
+        <w:t>）</w:t>
+      </w:r>
+      <w:r>
+        <w:t>：系统使用</w:t>
+      </w:r>
+      <w:r>
+        <w:t xml:space="preserve"> Sentence Transformers </w:t>
+      </w:r>
+      <w:r>
+        <w:t>的</w:t>
+      </w:r>
+      <w:r>
+        <w:t xml:space="preserve"> paraphrase-multilingual-MiniLM-L12-v2 </w:t>
+      </w:r>
+      <w:r>
+        <w:t>将问题和文本块转换为向量，再通过</w:t>
+      </w:r>
+      <w:r>
+        <w:t xml:space="preserve"> Chroma </w:t>
+      </w:r>
+      <w:r>
+        <w:t>检索语义相似的内容。普通问答默认检索</w:t>
+      </w:r>
+      <w:r>
+        <w:t xml:space="preserve"> Top-3</w:t>
+      </w:r>
+      <w:r>
+        <w:t>，但相似度排序不等于证据完整，可能遗漏正文中的关键信息。</w:t>
+      </w:r>
+    </w:p>
+    <w:p>
+      <w:pPr>
+        <w:numPr>
+          <w:ilvl w:val="0"/>
+          <w:numId w:val="16"/>
+        </w:numPr>
+      </w:pPr>
+      <w:r>
+        <w:rPr>
+          <w:b/>
+          <w:bCs/>
+        </w:rPr>
+        <w:t>元数据过滤（</w:t>
+      </w:r>
+      <w:r>
+        <w:rPr>
+          <w:b/>
+          <w:bCs/>
+        </w:rPr>
+        <w:t>Metadata Filtering</w:t>
+      </w:r>
+      <w:r>
+        <w:rPr>
+          <w:b/>
+          <w:bCs/>
+        </w:rPr>
+        <w:t>）</w:t>
+      </w:r>
+      <w:r>
+        <w:t>：利用论文文件名和页码等元数据限制检索范围。页码范围查询与普通语义检索的目标不同：前者侧重覆盖指定范围，后者侧重寻找与问题最相关的片段。</w:t>
+      </w:r>
+    </w:p>
+    <w:p>
+      <w:pPr>
+        <w:numPr>
+          <w:ilvl w:val="0"/>
+          <w:numId w:val="16"/>
+        </w:numPr>
+      </w:pPr>
+      <w:r>
+        <w:rPr>
+          <w:b/>
+          <w:bCs/>
+        </w:rPr>
+        <w:t>长文本分批处理（</w:t>
+      </w:r>
+      <w:r>
+        <w:rPr>
+          <w:b/>
+          <w:bCs/>
+        </w:rPr>
+        <w:t>Batch Summarization</w:t>
+      </w:r>
+      <w:r>
+        <w:rPr>
+          <w:b/>
+          <w:bCs/>
+        </w:rPr>
+        <w:t>）</w:t>
+      </w:r>
+      <w:r>
+        <w:t>：当多个文本块同时输入大语言模型时，可能超过模型的输入或输出长度限制。将文本分批总结，再合并摘要，可以降低单次调用的文本负担，但仍需检查信息遗漏与摘要准确性。</w:t>
+      </w:r>
+    </w:p>
+    <w:p>
+      <w:pPr>
+        <w:numPr>
+          <w:ilvl w:val="0"/>
+          <w:numId w:val="16"/>
+        </w:numPr>
+      </w:pPr>
+      <w:r>
+        <w:rPr>
+          <w:b/>
+          <w:bCs/>
+        </w:rPr>
+        <w:t>检索增强生成（</w:t>
+      </w:r>
+      <w:r>
+        <w:rPr>
+          <w:b/>
+          <w:bCs/>
+        </w:rPr>
+        <w:t>RAG</w:t>
+      </w:r>
+      <w:r>
+        <w:rPr>
+          <w:b/>
+          <w:bCs/>
+        </w:rPr>
+        <w:t>）中的证据溯源</w:t>
+      </w:r>
+      <w:r>
+        <w:t>：回答需要关联原文、论文文件名和</w:t>
+      </w:r>
+      <w:r>
+        <w:t xml:space="preserve"> PDF </w:t>
+      </w:r>
+      <w:r>
+        <w:t>页码。检索证据是否相关、页码是否正确、回答是否忠于原文，是评价科研问答可靠性的关键。</w:t>
+      </w:r>
+    </w:p>
+    <w:p>
+      <w:pPr>
+        <w:pStyle w:val="2"/>
+      </w:pPr>
+      <w:r>
+        <w:t>二、今日完成工作</w:t>
+      </w:r>
+    </w:p>
+    <w:p>
+      <w:pPr>
+        <w:numPr>
+          <w:ilvl w:val="0"/>
+          <w:numId w:val="17"/>
+        </w:numPr>
+      </w:pPr>
+      <w:r>
+        <w:rPr>
+          <w:b/>
+          <w:bCs/>
+        </w:rPr>
+        <w:t>排查</w:t>
+      </w:r>
+      <w:r>
+        <w:rPr>
+          <w:b/>
+          <w:bCs/>
+        </w:rPr>
+        <w:t xml:space="preserve"> PDF </w:t>
+      </w:r>
+      <w:r>
+        <w:rPr>
+          <w:b/>
+          <w:bCs/>
+        </w:rPr>
+        <w:t>页码元数据。</w:t>
+      </w:r>
+      <w:r>
+        <w:t xml:space="preserve"> </w:t>
+      </w:r>
+      <w:r>
+        <w:t>针对《</w:t>
+      </w:r>
+      <w:r>
+        <w:t>5G Key Technologies for Smart Railways</w:t>
+      </w:r>
+      <w:r>
+        <w:t>》检索到作者简介的问题，使用</w:t>
+      </w:r>
+      <w:r>
+        <w:t xml:space="preserve"> diagnose_author_pages() </w:t>
+      </w:r>
+      <w:r>
+        <w:t>查询</w:t>
+      </w:r>
+      <w:r>
+        <w:t xml:space="preserve"> Chroma </w:t>
+      </w:r>
+      <w:r>
+        <w:t>中的文档和元数据。发现疑似作者简介的多个</w:t>
+      </w:r>
+      <w:r>
+        <w:t xml:space="preserve"> Chunk </w:t>
+      </w:r>
+      <w:r>
+        <w:t>均记录为第</w:t>
+      </w:r>
+      <w:r>
+        <w:t xml:space="preserve"> 38 </w:t>
+      </w:r>
+      <w:r>
+        <w:t>页，与该内容位于论文末尾的情况相符。因此，当前证据不支持将这一现象简单归因于页码映射错误。</w:t>
+      </w:r>
+    </w:p>
+    <w:p>
+      <w:pPr>
+        <w:numPr>
+          <w:ilvl w:val="0"/>
+          <w:numId w:val="17"/>
+        </w:numPr>
+      </w:pPr>
+      <w:r>
+        <w:rPr>
+          <w:b/>
+          <w:bCs/>
+        </w:rPr>
+        <w:t>完善页码范围检索。</w:t>
+      </w:r>
+      <w:r>
+        <w:t xml:space="preserve"> </w:t>
+      </w:r>
+      <w:r>
+        <w:t>在</w:t>
+      </w:r>
+      <w:r>
+        <w:t xml:space="preserve"> retrieve() </w:t>
+      </w:r>
+      <w:r>
+        <w:t>中加入页码范围识别与元数据过滤逻辑，并保留论文文件名过滤。对于指定页码范围的问题，系统尝试获取范围内的文本块，避免只依赖</w:t>
+      </w:r>
+      <w:r>
+        <w:t xml:space="preserve"> Top-3 </w:t>
+      </w:r>
+      <w:r>
+        <w:t>语义检索。</w:t>
+      </w:r>
+    </w:p>
+    <w:p>
+      <w:pPr>
+        <w:numPr>
+          <w:ilvl w:val="0"/>
+          <w:numId w:val="17"/>
+        </w:numPr>
+      </w:pPr>
+      <w:r>
+        <w:rPr>
+          <w:b/>
+          <w:bCs/>
+        </w:rPr>
+        <w:t>改进长文本总结流程。</w:t>
+      </w:r>
+      <w:r>
+        <w:t xml:space="preserve"> </w:t>
+      </w:r>
+      <w:r>
+        <w:t>初次测试</w:t>
+      </w:r>
+      <w:r>
+        <w:t>“</w:t>
+      </w:r>
+      <w:r>
+        <w:t>这篇文章第</w:t>
+      </w:r>
+      <w:r>
+        <w:t>20–30</w:t>
+      </w:r>
+      <w:r>
+        <w:t>页讲了什么？</w:t>
+      </w:r>
+      <w:r>
+        <w:t>”</w:t>
+      </w:r>
+      <w:r>
+        <w:t>时，网页出现</w:t>
+      </w:r>
+      <w:r>
+        <w:t>“</w:t>
+      </w:r>
+      <w:r>
+        <w:t>模型回答达到长度限制，内容可能不完整</w:t>
+      </w:r>
+      <w:r>
+        <w:t>”</w:t>
+      </w:r>
+      <w:r>
+        <w:t>的错误提示。随后更新</w:t>
+      </w:r>
+      <w:r>
+        <w:t xml:space="preserve"> rag.py</w:t>
+      </w:r>
+      <w:r>
+        <w:t>，将指定范围的文本块按每批</w:t>
+      </w:r>
+      <w:r>
+        <w:t xml:space="preserve"> 5 </w:t>
+      </w:r>
+      <w:r>
+        <w:t>个进行总结，再调用模型整合各批摘要。用户随后确认更新后的功能运行成功。</w:t>
+      </w:r>
+    </w:p>
+    <w:p>
+      <w:pPr>
+        <w:numPr>
+          <w:ilvl w:val="0"/>
+          <w:numId w:val="17"/>
+        </w:numPr>
+      </w:pPr>
+      <w:r>
+        <w:rPr>
+          <w:b/>
+          <w:bCs/>
+        </w:rPr>
+        <w:t>保持现有网页功能。</w:t>
+      </w:r>
+      <w:r>
+        <w:t xml:space="preserve"> </w:t>
+      </w:r>
+      <w:r>
+        <w:t>保留</w:t>
+      </w:r>
+      <w:r>
+        <w:t xml:space="preserve"> Streamlit </w:t>
+      </w:r>
+      <w:r>
+        <w:t>论文上传、手动建立知识库、入库状态显示、论文选择、聊天历史和检索证据展示等已有功能。普通问题继续采用</w:t>
+      </w:r>
+      <w:r>
+        <w:t xml:space="preserve"> Top-K </w:t>
+      </w:r>
+      <w:r>
+        <w:t>语义检索，指定页码范围的问题使用分批总结流程。</w:t>
+      </w:r>
+    </w:p>
+    <w:p>
+      <w:pPr>
+        <w:pStyle w:val="2"/>
+      </w:pPr>
+      <w:r>
+        <w:t>三、遇到的问题及解决方法</w:t>
+      </w:r>
+    </w:p>
+    <w:tbl>
+      <w:tblPr>
+        <w:tblStyle w:val="af2"/>
+        <w:tblW w:w="0" w:type="auto"/>
+        <w:tblLook w:val="04A0" w:firstRow="1" w:lastRow="0" w:firstColumn="1" w:lastColumn="0" w:noHBand="0" w:noVBand="1"/>
+      </w:tblPr>
+      <w:tblGrid>
+        <w:gridCol w:w="2122"/>
+        <w:gridCol w:w="2929"/>
+        <w:gridCol w:w="5405"/>
+      </w:tblGrid>
+      <w:tr>
+        <w:tc>
+          <w:tcPr>
+            <w:tcW w:w="2122" w:type="dxa"/>
+            <w:vAlign w:val="center"/>
+            <w:hideMark/>
+          </w:tcPr>
+          <w:p>
+            <w:pPr>
+              <w:jc w:val="center"/>
+              <w:rPr>
+                <w:b/>
+                <w:bCs/>
+              </w:rPr>
+            </w:pPr>
+            <w:r>
+              <w:rPr>
+                <w:b/>
+                <w:bCs/>
+              </w:rPr>
+              <w:t>问题</w:t>
+            </w:r>
+          </w:p>
+        </w:tc>
+        <w:tc>
+          <w:tcPr>
+            <w:tcW w:w="2929" w:type="dxa"/>
+            <w:vAlign w:val="center"/>
+            <w:hideMark/>
+          </w:tcPr>
+          <w:p>
+            <w:pPr>
+              <w:jc w:val="center"/>
+              <w:rPr>
+                <w:b/>
+                <w:bCs/>
+              </w:rPr>
+            </w:pPr>
+            <w:r>
+              <w:rPr>
+                <w:b/>
+                <w:bCs/>
+              </w:rPr>
+              <w:t>原因</w:t>
+            </w:r>
+          </w:p>
+        </w:tc>
+        <w:tc>
+          <w:tcPr>
+            <w:tcW w:w="0" w:type="auto"/>
+            <w:vAlign w:val="center"/>
+            <w:hideMark/>
+          </w:tcPr>
+          <w:p>
+            <w:pPr>
+              <w:jc w:val="center"/>
+              <w:rPr>
+                <w:b/>
+                <w:bCs/>
+              </w:rPr>
+            </w:pPr>
+            <w:r>
+              <w:rPr>
+                <w:b/>
+                <w:bCs/>
+              </w:rPr>
+              <w:t>解决方法及结果</w:t>
+            </w:r>
+          </w:p>
+        </w:tc>
+      </w:tr>
+      <w:tr>
+        <w:tc>
+          <w:tcPr>
+            <w:tcW w:w="2122" w:type="dxa"/>
+            <w:vAlign w:val="center"/>
+            <w:hideMark/>
+          </w:tcPr>
+          <w:p>
+            <w:pPr>
+              <w:jc w:val="center"/>
+            </w:pPr>
+            <w:r>
+              <w:t>作者简介被检索为相关证据</w:t>
+            </w:r>
+          </w:p>
+        </w:tc>
+        <w:tc>
+          <w:tcPr>
+            <w:tcW w:w="2929" w:type="dxa"/>
+            <w:vAlign w:val="center"/>
+            <w:hideMark/>
+          </w:tcPr>
+          <w:p>
+            <w:pPr>
+              <w:jc w:val="center"/>
+            </w:pPr>
+            <w:r>
+              <w:t>语义相似度排序可能将作者简介排在正文之前</w:t>
+            </w:r>
+          </w:p>
+        </w:tc>
+        <w:tc>
+          <w:tcPr>
+            <w:tcW w:w="0" w:type="auto"/>
+            <w:vAlign w:val="center"/>
+            <w:hideMark/>
+          </w:tcPr>
+          <w:p>
+            <w:pPr>
+              <w:jc w:val="center"/>
+            </w:pPr>
+            <w:r>
+              <w:t>检查</w:t>
+            </w:r>
+            <w:r>
+              <w:t xml:space="preserve"> Chunk ID</w:t>
+            </w:r>
+            <w:r>
+              <w:t>、原文和页码元数据；确认部分作者简介</w:t>
+            </w:r>
+            <w:r>
+              <w:t xml:space="preserve"> Chunk </w:t>
+            </w:r>
+            <w:r>
+              <w:t>的页码为</w:t>
+            </w:r>
+            <w:r>
+              <w:t xml:space="preserve"> 38</w:t>
+            </w:r>
+            <w:r>
+              <w:t>，检索排序问题仍待优化</w:t>
+            </w:r>
+          </w:p>
+        </w:tc>
+      </w:tr>
+      <w:tr>
+        <w:tc>
+          <w:tcPr>
+            <w:tcW w:w="2122" w:type="dxa"/>
+            <w:vAlign w:val="center"/>
+            <w:hideMark/>
+          </w:tcPr>
+          <w:p>
+            <w:pPr>
+              <w:jc w:val="center"/>
+            </w:pPr>
+            <w:r>
+              <w:t>指定页码范围回</w:t>
+            </w:r>
+            <w:r>
+              <w:lastRenderedPageBreak/>
+              <w:t>答不完整</w:t>
+            </w:r>
+          </w:p>
+        </w:tc>
+        <w:tc>
+          <w:tcPr>
+            <w:tcW w:w="2929" w:type="dxa"/>
+            <w:vAlign w:val="center"/>
+            <w:hideMark/>
+          </w:tcPr>
+          <w:p>
+            <w:pPr>
+              <w:jc w:val="center"/>
+            </w:pPr>
+            <w:r>
+              <w:lastRenderedPageBreak/>
+              <w:t>大量文本块一次性输入模</w:t>
+            </w:r>
+            <w:r>
+              <w:lastRenderedPageBreak/>
+              <w:t>型，可能超过长度限制</w:t>
+            </w:r>
+          </w:p>
+        </w:tc>
+        <w:tc>
+          <w:tcPr>
+            <w:tcW w:w="0" w:type="auto"/>
+            <w:vAlign w:val="center"/>
+            <w:hideMark/>
+          </w:tcPr>
+          <w:p>
+            <w:pPr>
+              <w:jc w:val="center"/>
+            </w:pPr>
+            <w:r>
+              <w:lastRenderedPageBreak/>
+              <w:t>改为每批</w:t>
+            </w:r>
+            <w:r>
+              <w:t xml:space="preserve"> 5 </w:t>
+            </w:r>
+            <w:r>
+              <w:t>个</w:t>
+            </w:r>
+            <w:r>
+              <w:t xml:space="preserve"> Chunk </w:t>
+            </w:r>
+            <w:r>
+              <w:t>分别总结，再合并摘要；</w:t>
+            </w:r>
+            <w:r>
+              <w:lastRenderedPageBreak/>
+              <w:t>用户确认更新后运行成功</w:t>
+            </w:r>
+          </w:p>
+        </w:tc>
+      </w:tr>
+      <w:tr>
+        <w:tc>
+          <w:tcPr>
+            <w:tcW w:w="2122" w:type="dxa"/>
+            <w:vAlign w:val="center"/>
+            <w:hideMark/>
+          </w:tcPr>
+          <w:p>
+            <w:pPr>
+              <w:jc w:val="center"/>
+            </w:pPr>
+            <w:r>
+              <w:lastRenderedPageBreak/>
+              <w:t>普通</w:t>
+            </w:r>
+            <w:r>
+              <w:t xml:space="preserve"> Top-K </w:t>
+            </w:r>
+            <w:r>
+              <w:t>检索可能遗漏重要内容</w:t>
+            </w:r>
+          </w:p>
+        </w:tc>
+        <w:tc>
+          <w:tcPr>
+            <w:tcW w:w="2929" w:type="dxa"/>
+            <w:vAlign w:val="center"/>
+            <w:hideMark/>
+          </w:tcPr>
+          <w:p>
+            <w:pPr>
+              <w:jc w:val="center"/>
+            </w:pPr>
+            <w:r>
+              <w:t>候选数量有限，且语义相似度不保证证据覆盖完整</w:t>
+            </w:r>
+          </w:p>
+        </w:tc>
+        <w:tc>
+          <w:tcPr>
+            <w:tcW w:w="0" w:type="auto"/>
+            <w:vAlign w:val="center"/>
+            <w:hideMark/>
+          </w:tcPr>
+          <w:p>
+            <w:pPr>
+              <w:jc w:val="center"/>
+            </w:pPr>
+            <w:r>
+              <w:t>区分普通问题与页码范围问题的处理流程，后续继续评估召回率与排序质量</w:t>
+            </w:r>
+          </w:p>
+        </w:tc>
+      </w:tr>
+    </w:tbl>
+    <w:p>
+      <w:pPr>
+        <w:pStyle w:val="2"/>
+      </w:pPr>
+      <w:r>
+        <w:t>四、核心技术流程</w:t>
+      </w:r>
+    </w:p>
+    <w:p>
+      <w:r>
+        <w:rPr>
+          <w:b/>
+          <w:bCs/>
+        </w:rPr>
+        <w:t>普通</w:t>
+      </w:r>
+      <w:r>
+        <w:rPr>
+          <w:b/>
+          <w:bCs/>
+        </w:rPr>
+        <w:t xml:space="preserve"> RAG </w:t>
+      </w:r>
+      <w:r>
+        <w:rPr>
+          <w:b/>
+          <w:bCs/>
+        </w:rPr>
+        <w:t>问答：</w:t>
+      </w:r>
+    </w:p>
+    <w:p>
+      <w:r>
+        <w:t>用户问题</w:t>
+      </w:r>
+      <w:r>
+        <w:t xml:space="preserve"> → MiniLM </w:t>
+      </w:r>
+      <w:r>
+        <w:t>生成问题向量</w:t>
+      </w:r>
+      <w:r>
+        <w:t xml:space="preserve"> → Chroma </w:t>
+      </w:r>
+      <w:r>
+        <w:t>按语义相似度检索</w:t>
+      </w:r>
+      <w:r>
+        <w:t xml:space="preserve"> Top-K → </w:t>
+      </w:r>
+      <w:r>
+        <w:t>整理原文、文件名及页码</w:t>
+      </w:r>
+      <w:r>
+        <w:t xml:space="preserve"> → ask_llm() </w:t>
+      </w:r>
+      <w:r>
+        <w:t>生成回答</w:t>
+      </w:r>
+      <w:r>
+        <w:t xml:space="preserve"> → </w:t>
+      </w:r>
+      <w:r>
+        <w:t>展示答案与检索证据。</w:t>
+      </w:r>
+    </w:p>
+    <w:p>
+      <w:r>
+        <w:rPr>
+          <w:b/>
+          <w:bCs/>
+        </w:rPr>
+        <w:t>指定页码范围总结：</w:t>
+      </w:r>
+    </w:p>
+    <w:p>
+      <w:r>
+        <w:t>用户问题</w:t>
+      </w:r>
+      <w:r>
+        <w:t xml:space="preserve"> → </w:t>
+      </w:r>
+      <w:r>
+        <w:t>识别页码范围</w:t>
+      </w:r>
+      <w:r>
+        <w:t xml:space="preserve"> → </w:t>
+      </w:r>
+      <w:r>
+        <w:t>根据论文及页码元数据获取文本块</w:t>
+      </w:r>
+      <w:r>
+        <w:t xml:space="preserve"> → </w:t>
+      </w:r>
+      <w:r>
+        <w:t>按每批</w:t>
+      </w:r>
+      <w:r>
+        <w:t xml:space="preserve"> 5 </w:t>
+      </w:r>
+      <w:r>
+        <w:t>个</w:t>
+      </w:r>
+      <w:r>
+        <w:t xml:space="preserve"> Chunk </w:t>
+      </w:r>
+      <w:r>
+        <w:t>分批总结</w:t>
+      </w:r>
+      <w:r>
+        <w:t xml:space="preserve"> → </w:t>
+      </w:r>
+      <w:r>
+        <w:t>合并各批摘要</w:t>
+      </w:r>
+      <w:r>
+        <w:t xml:space="preserve"> → </w:t>
+      </w:r>
+      <w:r>
+        <w:t>大语言模型生成综合回答</w:t>
+      </w:r>
+      <w:r>
+        <w:t xml:space="preserve"> → </w:t>
+      </w:r>
+      <w:r>
+        <w:t>展示检索证据。</w:t>
+      </w:r>
+    </w:p>
+    <w:p>
+      <w:r>
+        <w:t>主要文件：</w:t>
+      </w:r>
+      <w:r>
+        <w:t xml:space="preserve">rag.py </w:t>
+      </w:r>
+      <w:r>
+        <w:t>负责</w:t>
+      </w:r>
+      <w:r>
+        <w:t xml:space="preserve"> PDF </w:t>
+      </w:r>
+      <w:r>
+        <w:t>解析、文本切分、向量入库、检索及</w:t>
+      </w:r>
+      <w:r>
+        <w:t xml:space="preserve"> RAG </w:t>
+      </w:r>
+      <w:r>
+        <w:t>问答；</w:t>
+      </w:r>
+      <w:r>
+        <w:t xml:space="preserve">app.py </w:t>
+      </w:r>
+      <w:r>
+        <w:t>负责</w:t>
+      </w:r>
+      <w:r>
+        <w:t xml:space="preserve"> Streamlit </w:t>
+      </w:r>
+      <w:r>
+        <w:t>网页交互；</w:t>
+      </w:r>
+      <w:r>
+        <w:t xml:space="preserve">llm_client.py </w:t>
+      </w:r>
+      <w:r>
+        <w:t>负责大语言模型调用。</w:t>
+      </w:r>
+    </w:p>
+    <w:p>
+      <w:pPr>
+        <w:pStyle w:val="2"/>
+      </w:pPr>
+      <w:r>
+        <w:t>五、今日收获与总结</w:t>
+      </w:r>
+    </w:p>
+    <w:p>
+      <w:r>
+        <w:t>今天进一步理解了语义检索、元数据过滤与长文本总结之间的区别。普通</w:t>
+      </w:r>
+      <w:r>
+        <w:t xml:space="preserve"> Top-K </w:t>
+      </w:r>
+      <w:r>
+        <w:t>检索强调相关性，页码范围检索强调指定范围内的内容覆盖，而分批总结用于控制单次模型调用的文本规模。三者解决的是不同问题，不能相互替代。</w:t>
+      </w:r>
+    </w:p>
+    <w:p>
+      <w:r>
+        <w:t>实践中，系统已经实现并运行验证了指定页码范围的分批总结流程，但这不代表检索质量已经全面改善。分批总结仍可能遗漏细节或引入摘要偏差；参考文献、作者简介等干扰内容也尚未彻底解决。当前阶段的重点应从功能实现转向准确性、完整性和可重复验证。</w:t>
+      </w:r>
+    </w:p>
+    <w:p>
+      <w:pPr>
+        <w:pStyle w:val="2"/>
+      </w:pPr>
+      <w:r>
+        <w:t>六、下一步计划</w:t>
+      </w:r>
+    </w:p>
+    <w:p>
+      <w:pPr>
+        <w:numPr>
+          <w:ilvl w:val="0"/>
+          <w:numId w:val="18"/>
+        </w:numPr>
+      </w:pPr>
+      <w:r>
+        <w:rPr>
+          <w:b/>
+          <w:bCs/>
+        </w:rPr>
+        <w:t>优化检索质量</w:t>
+      </w:r>
+      <w:r>
+        <w:rPr>
+          <w:b/>
+          <w:bCs/>
+        </w:rPr>
+        <w:t>：</w:t>
+      </w:r>
+      <w:r>
+        <w:t>使用固定科研问题检查</w:t>
+      </w:r>
+      <w:r>
+        <w:t xml:space="preserve"> Top-K </w:t>
+      </w:r>
+      <w:r>
+        <w:t>返回的原文、页码和距离，分析正文为何未被优先检索。</w:t>
+      </w:r>
+    </w:p>
+    <w:p>
+      <w:pPr>
+        <w:numPr>
+          <w:ilvl w:val="0"/>
+          <w:numId w:val="18"/>
+        </w:numPr>
+      </w:pPr>
+      <w:r>
+        <w:rPr>
+          <w:b/>
+          <w:bCs/>
+        </w:rPr>
+        <w:t>评估召回与排序</w:t>
+      </w:r>
+      <w:r>
+        <w:rPr>
+          <w:b/>
+          <w:bCs/>
+        </w:rPr>
+        <w:t>：</w:t>
+      </w:r>
+      <w:r>
+        <w:t>对比不同候选数量，研究是否需要增加候选文本块并引入</w:t>
+      </w:r>
+      <w:r>
+        <w:t xml:space="preserve"> Reranker</w:t>
+      </w:r>
+      <w:r>
+        <w:t>。</w:t>
+      </w:r>
+    </w:p>
+    <w:p>
+      <w:pPr>
+        <w:numPr>
+          <w:ilvl w:val="0"/>
+          <w:numId w:val="18"/>
+        </w:numPr>
+      </w:pPr>
+      <w:r>
+        <w:rPr>
+          <w:b/>
+          <w:bCs/>
+        </w:rPr>
+        <w:t>处理</w:t>
+      </w:r>
+      <w:r>
+        <w:rPr>
+          <w:b/>
+          <w:bCs/>
+        </w:rPr>
+        <w:t xml:space="preserve"> PDF </w:t>
+      </w:r>
+      <w:r>
+        <w:rPr>
+          <w:b/>
+          <w:bCs/>
+        </w:rPr>
+        <w:t>文本噪声</w:t>
+      </w:r>
+      <w:r>
+        <w:rPr>
+          <w:b/>
+          <w:bCs/>
+        </w:rPr>
+        <w:t>：</w:t>
+      </w:r>
+      <w:r>
+        <w:t>研究识别参考文献、作者简介及页眉页脚的方法，避免不相关内容干扰回答。</w:t>
+      </w:r>
+    </w:p>
+    <w:p>
+      <w:pPr>
+        <w:numPr>
+          <w:ilvl w:val="0"/>
+          <w:numId w:val="18"/>
+        </w:numPr>
+      </w:pPr>
+      <w:r>
+        <w:rPr>
+          <w:b/>
+          <w:bCs/>
+        </w:rPr>
+        <w:t>验证页码范围功能</w:t>
+      </w:r>
+      <w:r>
+        <w:rPr>
+          <w:b/>
+          <w:bCs/>
+        </w:rPr>
+        <w:t>：</w:t>
+      </w:r>
+      <w:r>
+        <w:t>测试不同范围、长论文和缺少有效文本的页面，检查摘要覆盖度及引用准确性。</w:t>
+      </w:r>
+    </w:p>
+    <w:p>
+      <w:pPr>
+        <w:numPr>
+          <w:ilvl w:val="0"/>
+          <w:numId w:val="18"/>
+        </w:numPr>
+      </w:pPr>
+      <w:r>
+        <w:rPr>
+          <w:b/>
+          <w:bCs/>
+        </w:rPr>
+        <w:t>完善知识库管理</w:t>
+      </w:r>
+      <w:r>
+        <w:rPr>
+          <w:b/>
+          <w:bCs/>
+        </w:rPr>
+        <w:t>：</w:t>
+      </w:r>
+      <w:r>
+        <w:t>验证重复入库、论文更新和删除机制，避免旧</w:t>
+      </w:r>
+      <w:r>
+        <w:t xml:space="preserve"> Chunk </w:t>
+      </w:r>
+      <w:r>
+        <w:t>残留。</w:t>
+      </w:r>
+    </w:p>
+    <w:p>
+      <w:pPr>
+        <w:numPr>
+          <w:ilvl w:val="0"/>
+          <w:numId w:val="18"/>
+        </w:numPr>
+      </w:pPr>
+      <w:r>
+        <w:rPr>
+          <w:b/>
+          <w:bCs/>
+        </w:rPr>
+        <w:t>保存稳定版本</w:t>
+      </w:r>
+      <w:r>
+        <w:rPr>
+          <w:b/>
+          <w:bCs/>
+        </w:rPr>
+        <w:t>：</w:t>
+      </w:r>
+      <w:r>
+        <w:t>检查</w:t>
+      </w:r>
+      <w:r>
+        <w:t xml:space="preserve"> Git </w:t>
+      </w:r>
+      <w:r>
+        <w:t>变更，将当前可运行版本提交至</w:t>
+      </w:r>
+      <w:r>
+        <w:t xml:space="preserve"> GitHub</w:t>
+      </w:r>
+      <w:r>
+        <w:t>，为后续检索优化保留回退点。</w:t>
+      </w:r>
+    </w:p>
+    <w:p>
+      <w:pPr>
+        <w:rPr>
+          <w:rFonts w:hint="eastAsia"/>
+        </w:rPr>
+      </w:pPr>
+    </w:p>
     <w:sectPr>
       <w:pgSz w:w="11906" w:h="16838"/>
       <w:pgMar w:top="720" w:right="720" w:bottom="720" w:left="720" w:header="851" w:footer="992" w:gutter="0"/>
@@ -2152,6 +3206,232 @@
     </w:lvl>
   </w:abstractNum>
   <w:abstractNum w:abstractNumId="2" w15:restartNumberingAfterBreak="0">
+    <w:nsid w:val="1DB85E43"/>
+    <w:multiLevelType w:val="multilevel"/>
+    <w:tmpl w:val="0FC206CC"/>
+    <w:lvl w:ilvl="0">
+      <w:start w:val="1"/>
+      <w:numFmt w:val="decimal"/>
+      <w:lvlText w:val="%1."/>
+      <w:lvlJc w:val="left"/>
+      <w:pPr>
+        <w:tabs>
+          <w:tab w:val="num" w:pos="720"/>
+        </w:tabs>
+        <w:ind w:left="720" w:hanging="360"/>
+      </w:pPr>
+    </w:lvl>
+    <w:lvl w:ilvl="1" w:tentative="1">
+      <w:start w:val="1"/>
+      <w:numFmt w:val="decimal"/>
+      <w:lvlText w:val="%2."/>
+      <w:lvlJc w:val="left"/>
+      <w:pPr>
+        <w:tabs>
+          <w:tab w:val="num" w:pos="1440"/>
+        </w:tabs>
+        <w:ind w:left="1440" w:hanging="360"/>
+      </w:pPr>
+    </w:lvl>
+    <w:lvl w:ilvl="2" w:tentative="1">
+      <w:start w:val="1"/>
+      <w:numFmt w:val="decimal"/>
+      <w:lvlText w:val="%3."/>
+      <w:lvlJc w:val="left"/>
+      <w:pPr>
+        <w:tabs>
+          <w:tab w:val="num" w:pos="2160"/>
+        </w:tabs>
+        <w:ind w:left="2160" w:hanging="360"/>
+      </w:pPr>
+    </w:lvl>
+    <w:lvl w:ilvl="3" w:tentative="1">
+      <w:start w:val="1"/>
+      <w:numFmt w:val="decimal"/>
+      <w:lvlText w:val="%4."/>
+      <w:lvlJc w:val="left"/>
+      <w:pPr>
+        <w:tabs>
+          <w:tab w:val="num" w:pos="2880"/>
+        </w:tabs>
+        <w:ind w:left="2880" w:hanging="360"/>
+      </w:pPr>
+    </w:lvl>
+    <w:lvl w:ilvl="4" w:tentative="1">
+      <w:start w:val="1"/>
+      <w:numFmt w:val="decimal"/>
+      <w:lvlText w:val="%5."/>
+      <w:lvlJc w:val="left"/>
+      <w:pPr>
+        <w:tabs>
+          <w:tab w:val="num" w:pos="3600"/>
+        </w:tabs>
+        <w:ind w:left="3600" w:hanging="360"/>
+      </w:pPr>
+    </w:lvl>
+    <w:lvl w:ilvl="5" w:tentative="1">
+      <w:start w:val="1"/>
+      <w:numFmt w:val="decimal"/>
+      <w:lvlText w:val="%6."/>
+      <w:lvlJc w:val="left"/>
+      <w:pPr>
+        <w:tabs>
+          <w:tab w:val="num" w:pos="4320"/>
+        </w:tabs>
+        <w:ind w:left="4320" w:hanging="360"/>
+      </w:pPr>
+    </w:lvl>
+    <w:lvl w:ilvl="6" w:tentative="1">
+      <w:start w:val="1"/>
+      <w:numFmt w:val="decimal"/>
+      <w:lvlText w:val="%7."/>
+      <w:lvlJc w:val="left"/>
+      <w:pPr>
+        <w:tabs>
+          <w:tab w:val="num" w:pos="5040"/>
+        </w:tabs>
+        <w:ind w:left="5040" w:hanging="360"/>
+      </w:pPr>
+    </w:lvl>
+    <w:lvl w:ilvl="7" w:tentative="1">
+      <w:start w:val="1"/>
+      <w:numFmt w:val="decimal"/>
+      <w:lvlText w:val="%8."/>
+      <w:lvlJc w:val="left"/>
+      <w:pPr>
+        <w:tabs>
+          <w:tab w:val="num" w:pos="5760"/>
+        </w:tabs>
+        <w:ind w:left="5760" w:hanging="360"/>
+      </w:pPr>
+    </w:lvl>
+    <w:lvl w:ilvl="8" w:tentative="1">
+      <w:start w:val="1"/>
+      <w:numFmt w:val="decimal"/>
+      <w:lvlText w:val="%9."/>
+      <w:lvlJc w:val="left"/>
+      <w:pPr>
+        <w:tabs>
+          <w:tab w:val="num" w:pos="6480"/>
+        </w:tabs>
+        <w:ind w:left="6480" w:hanging="360"/>
+      </w:pPr>
+    </w:lvl>
+  </w:abstractNum>
+  <w:abstractNum w:abstractNumId="3" w15:restartNumberingAfterBreak="0">
+    <w:nsid w:val="22C46B42"/>
+    <w:multiLevelType w:val="multilevel"/>
+    <w:tmpl w:val="05B695AC"/>
+    <w:lvl w:ilvl="0">
+      <w:start w:val="1"/>
+      <w:numFmt w:val="decimal"/>
+      <w:lvlText w:val="%1."/>
+      <w:lvlJc w:val="left"/>
+      <w:pPr>
+        <w:tabs>
+          <w:tab w:val="num" w:pos="720"/>
+        </w:tabs>
+        <w:ind w:left="720" w:hanging="360"/>
+      </w:pPr>
+    </w:lvl>
+    <w:lvl w:ilvl="1" w:tentative="1">
+      <w:start w:val="1"/>
+      <w:numFmt w:val="decimal"/>
+      <w:lvlText w:val="%2."/>
+      <w:lvlJc w:val="left"/>
+      <w:pPr>
+        <w:tabs>
+          <w:tab w:val="num" w:pos="1440"/>
+        </w:tabs>
+        <w:ind w:left="1440" w:hanging="360"/>
+      </w:pPr>
+    </w:lvl>
+    <w:lvl w:ilvl="2" w:tentative="1">
+      <w:start w:val="1"/>
+      <w:numFmt w:val="decimal"/>
+      <w:lvlText w:val="%3."/>
+      <w:lvlJc w:val="left"/>
+      <w:pPr>
+        <w:tabs>
+          <w:tab w:val="num" w:pos="2160"/>
+        </w:tabs>
+        <w:ind w:left="2160" w:hanging="360"/>
+      </w:pPr>
+    </w:lvl>
+    <w:lvl w:ilvl="3" w:tentative="1">
+      <w:start w:val="1"/>
+      <w:numFmt w:val="decimal"/>
+      <w:lvlText w:val="%4."/>
+      <w:lvlJc w:val="left"/>
+      <w:pPr>
+        <w:tabs>
+          <w:tab w:val="num" w:pos="2880"/>
+        </w:tabs>
+        <w:ind w:left="2880" w:hanging="360"/>
+      </w:pPr>
+    </w:lvl>
+    <w:lvl w:ilvl="4" w:tentative="1">
+      <w:start w:val="1"/>
+      <w:numFmt w:val="decimal"/>
+      <w:lvlText w:val="%5."/>
+      <w:lvlJc w:val="left"/>
+      <w:pPr>
+        <w:tabs>
+          <w:tab w:val="num" w:pos="3600"/>
+        </w:tabs>
+        <w:ind w:left="3600" w:hanging="360"/>
+      </w:pPr>
+    </w:lvl>
+    <w:lvl w:ilvl="5" w:tentative="1">
+      <w:start w:val="1"/>
+      <w:numFmt w:val="decimal"/>
+      <w:lvlText w:val="%6."/>
+      <w:lvlJc w:val="left"/>
+      <w:pPr>
+        <w:tabs>
+          <w:tab w:val="num" w:pos="4320"/>
+        </w:tabs>
+        <w:ind w:left="4320" w:hanging="360"/>
+      </w:pPr>
+    </w:lvl>
+    <w:lvl w:ilvl="6" w:tentative="1">
+      <w:start w:val="1"/>
+      <w:numFmt w:val="decimal"/>
+      <w:lvlText w:val="%7."/>
+      <w:lvlJc w:val="left"/>
+      <w:pPr>
+        <w:tabs>
+          <w:tab w:val="num" w:pos="5040"/>
+        </w:tabs>
+        <w:ind w:left="5040" w:hanging="360"/>
+      </w:pPr>
+    </w:lvl>
+    <w:lvl w:ilvl="7" w:tentative="1">
+      <w:start w:val="1"/>
+      <w:numFmt w:val="decimal"/>
+      <w:lvlText w:val="%8."/>
+      <w:lvlJc w:val="left"/>
+      <w:pPr>
+        <w:tabs>
+          <w:tab w:val="num" w:pos="5760"/>
+        </w:tabs>
+        <w:ind w:left="5760" w:hanging="360"/>
+      </w:pPr>
+    </w:lvl>
+    <w:lvl w:ilvl="8" w:tentative="1">
+      <w:start w:val="1"/>
+      <w:numFmt w:val="decimal"/>
+      <w:lvlText w:val="%9."/>
+      <w:lvlJc w:val="left"/>
+      <w:pPr>
+        <w:tabs>
+          <w:tab w:val="num" w:pos="6480"/>
+        </w:tabs>
+        <w:ind w:left="6480" w:hanging="360"/>
+      </w:pPr>
+    </w:lvl>
+  </w:abstractNum>
+  <w:abstractNum w:abstractNumId="4" w15:restartNumberingAfterBreak="0">
     <w:nsid w:val="26E255A3"/>
     <w:multiLevelType w:val="multilevel"/>
     <w:tmpl w:val="37B0ABA0"/>
@@ -2264,7 +3544,7 @@
       </w:pPr>
     </w:lvl>
   </w:abstractNum>
-  <w:abstractNum w:abstractNumId="3" w15:restartNumberingAfterBreak="0">
+  <w:abstractNum w:abstractNumId="5" w15:restartNumberingAfterBreak="0">
     <w:nsid w:val="285A46C9"/>
     <w:multiLevelType w:val="multilevel"/>
     <w:tmpl w:val="977E68AC"/>
@@ -2413,7 +3693,7 @@
       </w:rPr>
     </w:lvl>
   </w:abstractNum>
-  <w:abstractNum w:abstractNumId="4" w15:restartNumberingAfterBreak="0">
+  <w:abstractNum w:abstractNumId="6" w15:restartNumberingAfterBreak="0">
     <w:nsid w:val="2AAA658C"/>
     <w:multiLevelType w:val="multilevel"/>
     <w:tmpl w:val="E3409B7A"/>
@@ -2562,7 +3842,7 @@
       </w:rPr>
     </w:lvl>
   </w:abstractNum>
-  <w:abstractNum w:abstractNumId="5" w15:restartNumberingAfterBreak="0">
+  <w:abstractNum w:abstractNumId="7" w15:restartNumberingAfterBreak="0">
     <w:nsid w:val="338C2D9F"/>
     <w:multiLevelType w:val="multilevel"/>
     <w:tmpl w:val="E1D67E16"/>
@@ -2675,7 +3955,7 @@
       </w:pPr>
     </w:lvl>
   </w:abstractNum>
-  <w:abstractNum w:abstractNumId="6" w15:restartNumberingAfterBreak="0">
+  <w:abstractNum w:abstractNumId="8" w15:restartNumberingAfterBreak="0">
     <w:nsid w:val="3BE05216"/>
     <w:multiLevelType w:val="multilevel"/>
     <w:tmpl w:val="D5585096"/>
@@ -2824,7 +4104,7 @@
       </w:rPr>
     </w:lvl>
   </w:abstractNum>
-  <w:abstractNum w:abstractNumId="7" w15:restartNumberingAfterBreak="0">
+  <w:abstractNum w:abstractNumId="9" w15:restartNumberingAfterBreak="0">
     <w:nsid w:val="3F590446"/>
     <w:multiLevelType w:val="multilevel"/>
     <w:tmpl w:val="5A0CD6AE"/>
@@ -2937,7 +4217,7 @@
       </w:pPr>
     </w:lvl>
   </w:abstractNum>
-  <w:abstractNum w:abstractNumId="8" w15:restartNumberingAfterBreak="0">
+  <w:abstractNum w:abstractNumId="10" w15:restartNumberingAfterBreak="0">
     <w:nsid w:val="3F7B25F8"/>
     <w:multiLevelType w:val="multilevel"/>
     <w:tmpl w:val="B6FA4972"/>
@@ -3086,7 +4366,7 @@
       </w:rPr>
     </w:lvl>
   </w:abstractNum>
-  <w:abstractNum w:abstractNumId="9" w15:restartNumberingAfterBreak="0">
+  <w:abstractNum w:abstractNumId="11" w15:restartNumberingAfterBreak="0">
     <w:nsid w:val="41F340B4"/>
     <w:multiLevelType w:val="multilevel"/>
     <w:tmpl w:val="EFFA0056"/>
@@ -3235,7 +4515,7 @@
       </w:rPr>
     </w:lvl>
   </w:abstractNum>
-  <w:abstractNum w:abstractNumId="10" w15:restartNumberingAfterBreak="0">
+  <w:abstractNum w:abstractNumId="12" w15:restartNumberingAfterBreak="0">
     <w:nsid w:val="5BCC7B63"/>
     <w:multiLevelType w:val="multilevel"/>
     <w:tmpl w:val="A87AFD8E"/>
@@ -3384,7 +4664,120 @@
       </w:rPr>
     </w:lvl>
   </w:abstractNum>
-  <w:abstractNum w:abstractNumId="11" w15:restartNumberingAfterBreak="0">
+  <w:abstractNum w:abstractNumId="13" w15:restartNumberingAfterBreak="0">
+    <w:nsid w:val="5BF93201"/>
+    <w:multiLevelType w:val="multilevel"/>
+    <w:tmpl w:val="2CAAEC68"/>
+    <w:lvl w:ilvl="0">
+      <w:start w:val="1"/>
+      <w:numFmt w:val="decimal"/>
+      <w:lvlText w:val="%1."/>
+      <w:lvlJc w:val="left"/>
+      <w:pPr>
+        <w:tabs>
+          <w:tab w:val="num" w:pos="720"/>
+        </w:tabs>
+        <w:ind w:left="720" w:hanging="360"/>
+      </w:pPr>
+    </w:lvl>
+    <w:lvl w:ilvl="1" w:tentative="1">
+      <w:start w:val="1"/>
+      <w:numFmt w:val="decimal"/>
+      <w:lvlText w:val="%2."/>
+      <w:lvlJc w:val="left"/>
+      <w:pPr>
+        <w:tabs>
+          <w:tab w:val="num" w:pos="1440"/>
+        </w:tabs>
+        <w:ind w:left="1440" w:hanging="360"/>
+      </w:pPr>
+    </w:lvl>
+    <w:lvl w:ilvl="2" w:tentative="1">
+      <w:start w:val="1"/>
+      <w:numFmt w:val="decimal"/>
+      <w:lvlText w:val="%3."/>
+      <w:lvlJc w:val="left"/>
+      <w:pPr>
+        <w:tabs>
+          <w:tab w:val="num" w:pos="2160"/>
+        </w:tabs>
+        <w:ind w:left="2160" w:hanging="360"/>
+      </w:pPr>
+    </w:lvl>
+    <w:lvl w:ilvl="3" w:tentative="1">
+      <w:start w:val="1"/>
+      <w:numFmt w:val="decimal"/>
+      <w:lvlText w:val="%4."/>
+      <w:lvlJc w:val="left"/>
+      <w:pPr>
+        <w:tabs>
+          <w:tab w:val="num" w:pos="2880"/>
+        </w:tabs>
+        <w:ind w:left="2880" w:hanging="360"/>
+      </w:pPr>
+    </w:lvl>
+    <w:lvl w:ilvl="4" w:tentative="1">
+      <w:start w:val="1"/>
+      <w:numFmt w:val="decimal"/>
+      <w:lvlText w:val="%5."/>
+      <w:lvlJc w:val="left"/>
+      <w:pPr>
+        <w:tabs>
+          <w:tab w:val="num" w:pos="3600"/>
+        </w:tabs>
+        <w:ind w:left="3600" w:hanging="360"/>
+      </w:pPr>
+    </w:lvl>
+    <w:lvl w:ilvl="5" w:tentative="1">
+      <w:start w:val="1"/>
+      <w:numFmt w:val="decimal"/>
+      <w:lvlText w:val="%6."/>
+      <w:lvlJc w:val="left"/>
+      <w:pPr>
+        <w:tabs>
+          <w:tab w:val="num" w:pos="4320"/>
+        </w:tabs>
+        <w:ind w:left="4320" w:hanging="360"/>
+      </w:pPr>
+    </w:lvl>
+    <w:lvl w:ilvl="6" w:tentative="1">
+      <w:start w:val="1"/>
+      <w:numFmt w:val="decimal"/>
+      <w:lvlText w:val="%7."/>
+      <w:lvlJc w:val="left"/>
+      <w:pPr>
+        <w:tabs>
+          <w:tab w:val="num" w:pos="5040"/>
+        </w:tabs>
+        <w:ind w:left="5040" w:hanging="360"/>
+      </w:pPr>
+    </w:lvl>
+    <w:lvl w:ilvl="7" w:tentative="1">
+      <w:start w:val="1"/>
+      <w:numFmt w:val="decimal"/>
+      <w:lvlText w:val="%8."/>
+      <w:lvlJc w:val="left"/>
+      <w:pPr>
+        <w:tabs>
+          <w:tab w:val="num" w:pos="5760"/>
+        </w:tabs>
+        <w:ind w:left="5760" w:hanging="360"/>
+      </w:pPr>
+    </w:lvl>
+    <w:lvl w:ilvl="8" w:tentative="1">
+      <w:start w:val="1"/>
+      <w:numFmt w:val="decimal"/>
+      <w:lvlText w:val="%9."/>
+      <w:lvlJc w:val="left"/>
+      <w:pPr>
+        <w:tabs>
+          <w:tab w:val="num" w:pos="6480"/>
+        </w:tabs>
+        <w:ind w:left="6480" w:hanging="360"/>
+      </w:pPr>
+    </w:lvl>
+  </w:abstractNum>
+  <w:abstractNum w:abstractNumId="14" w15:restartNumberingAfterBreak="0">
     <w:nsid w:val="5F1D2D33"/>
     <w:multiLevelType w:val="multilevel"/>
     <w:tmpl w:val="563C8FAE"/>
@@ -3533,7 +4926,7 @@
       </w:rPr>
     </w:lvl>
   </w:abstractNum>
-  <w:abstractNum w:abstractNumId="12" w15:restartNumberingAfterBreak="0">
+  <w:abstractNum w:abstractNumId="15" w15:restartNumberingAfterBreak="0">
     <w:nsid w:val="65BB14AA"/>
     <w:multiLevelType w:val="multilevel"/>
     <w:tmpl w:val="F1F61766"/>
@@ -3682,7 +5075,7 @@
       </w:rPr>
     </w:lvl>
   </w:abstractNum>
-  <w:abstractNum w:abstractNumId="13" w15:restartNumberingAfterBreak="0">
+  <w:abstractNum w:abstractNumId="16" w15:restartNumberingAfterBreak="0">
     <w:nsid w:val="737401F0"/>
     <w:multiLevelType w:val="multilevel"/>
     <w:tmpl w:val="ED602C5C"/>
@@ -3831,7 +5224,7 @@
       </w:rPr>
     </w:lvl>
   </w:abstractNum>
-  <w:abstractNum w:abstractNumId="14" w15:restartNumberingAfterBreak="0">
+  <w:abstractNum w:abstractNumId="17" w15:restartNumberingAfterBreak="0">
     <w:nsid w:val="7FA8215F"/>
     <w:multiLevelType w:val="multilevel"/>
     <w:tmpl w:val="DCECF7E4"/>
@@ -3981,49 +5374,58 @@
     </w:lvl>
   </w:abstractNum>
   <w:num w:numId="1" w16cid:durableId="834295843">
-    <w:abstractNumId w:val="7"/>
+    <w:abstractNumId w:val="9"/>
   </w:num>
   <w:num w:numId="2" w16cid:durableId="165707542">
-    <w:abstractNumId w:val="8"/>
+    <w:abstractNumId w:val="10"/>
   </w:num>
   <w:num w:numId="3" w16cid:durableId="722098386">
-    <w:abstractNumId w:val="9"/>
+    <w:abstractNumId w:val="11"/>
   </w:num>
   <w:num w:numId="4" w16cid:durableId="1041589841">
     <w:abstractNumId w:val="0"/>
   </w:num>
   <w:num w:numId="5" w16cid:durableId="984747241">
-    <w:abstractNumId w:val="11"/>
+    <w:abstractNumId w:val="14"/>
   </w:num>
   <w:num w:numId="6" w16cid:durableId="2098018560">
-    <w:abstractNumId w:val="3"/>
+    <w:abstractNumId w:val="5"/>
   </w:num>
   <w:num w:numId="7" w16cid:durableId="255358769">
+    <w:abstractNumId w:val="15"/>
+  </w:num>
+  <w:num w:numId="8" w16cid:durableId="2133282748">
     <w:abstractNumId w:val="12"/>
   </w:num>
-  <w:num w:numId="8" w16cid:durableId="2133282748">
-    <w:abstractNumId w:val="10"/>
-  </w:num>
   <w:num w:numId="9" w16cid:durableId="2137677064">
-    <w:abstractNumId w:val="4"/>
+    <w:abstractNumId w:val="6"/>
   </w:num>
   <w:num w:numId="10" w16cid:durableId="1239680733">
-    <w:abstractNumId w:val="5"/>
+    <w:abstractNumId w:val="7"/>
   </w:num>
   <w:num w:numId="11" w16cid:durableId="1998875240">
     <w:abstractNumId w:val="1"/>
   </w:num>
   <w:num w:numId="12" w16cid:durableId="211313274">
+    <w:abstractNumId w:val="16"/>
+  </w:num>
+  <w:num w:numId="13" w16cid:durableId="2040549948">
+    <w:abstractNumId w:val="8"/>
+  </w:num>
+  <w:num w:numId="14" w16cid:durableId="918514919">
+    <w:abstractNumId w:val="17"/>
+  </w:num>
+  <w:num w:numId="15" w16cid:durableId="1599215998">
+    <w:abstractNumId w:val="4"/>
+  </w:num>
+  <w:num w:numId="16" w16cid:durableId="526604626">
+    <w:abstractNumId w:val="2"/>
+  </w:num>
+  <w:num w:numId="17" w16cid:durableId="1880049431">
     <w:abstractNumId w:val="13"/>
   </w:num>
-  <w:num w:numId="13" w16cid:durableId="2040549948">
-    <w:abstractNumId w:val="6"/>
-  </w:num>
-  <w:num w:numId="14" w16cid:durableId="918514919">
-    <w:abstractNumId w:val="14"/>
-  </w:num>
-  <w:num w:numId="15" w16cid:durableId="1599215998">
-    <w:abstractNumId w:val="2"/>
+  <w:num w:numId="18" w16cid:durableId="762579477">
+    <w:abstractNumId w:val="3"/>
   </w:num>
 </w:numbering>
 </file>

</xml_diff>